<commit_message>
oza sir bunch updated
</commit_message>
<xml_diff>
--- a/TheorynCoding/Study Material/Java Overall/Java Overall/Quick Java/oza sir/Merged_Team_Tech_Lead_Unique_Questions n Answers.docx
+++ b/TheorynCoding/Study Material/Java Overall/Java Overall/Quick Java/oza sir/Merged_Team_Tech_Lead_Unique_Questions n Answers.docx
@@ -597,7 +597,13 @@
         <w:rPr>
           <w:highlight w:val="yellow"/>
         </w:rPr>
-        <w:t xml:space="preserve">How does Microservices architecture support independent deployment? </w:t>
+        <w:t xml:space="preserve">How does </w:t>
+      </w:r>
+      <w:r>
+        <w:rPr>
+          <w:highlight w:val="yellow"/>
+        </w:rPr>
+        <w:t xml:space="preserve">Microservices architecture support independent deployment? </w:t>
       </w:r>
     </w:p>
     <w:p>
@@ -607,20 +613,30 @@
           <w:numId w:val="11"/>
         </w:numPr>
         <w:spacing w:before="100" w:beforeAutospacing="1" w:after="100" w:afterAutospacing="1" w:line="240" w:lineRule="auto"/>
-      </w:pPr>
-      <w:r>
+        <w:rPr>
+          <w:highlight w:val="yellow"/>
+        </w:rPr>
+      </w:pPr>
+      <w:r>
+        <w:rPr>
+          <w:highlight w:val="yellow"/>
+        </w:rPr>
         <w:t xml:space="preserve">What problems can occur when one </w:t>
       </w:r>
       <w:proofErr w:type="spellStart"/>
       <w:r>
+        <w:rPr>
+          <w:highlight w:val="yellow"/>
+        </w:rPr>
         <w:t>microservice</w:t>
       </w:r>
       <w:proofErr w:type="spellEnd"/>
       <w:r>
+        <w:rPr>
+          <w:highlight w:val="yellow"/>
+        </w:rPr>
         <w:t xml:space="preserve"> goes down? </w:t>
       </w:r>
-      <w:bookmarkStart w:id="0" w:name="_GoBack"/>
-      <w:bookmarkEnd w:id="0"/>
     </w:p>
     <w:p>
       <w:pPr>
@@ -629,19 +645,31 @@
           <w:numId w:val="11"/>
         </w:numPr>
         <w:spacing w:before="100" w:beforeAutospacing="1" w:after="100" w:afterAutospacing="1" w:line="240" w:lineRule="auto"/>
-      </w:pPr>
-      <w:r>
+        <w:rPr>
+          <w:highlight w:val="yellow"/>
+        </w:rPr>
+      </w:pPr>
+      <w:r>
+        <w:rPr>
+          <w:highlight w:val="yellow"/>
+        </w:rPr>
         <w:t xml:space="preserve">What is </w:t>
       </w:r>
       <w:r>
         <w:rPr>
           <w:rStyle w:val="Strong"/>
+          <w:highlight w:val="yellow"/>
         </w:rPr>
         <w:t>Cascading Failure</w:t>
       </w:r>
       <w:r>
+        <w:rPr>
+          <w:highlight w:val="yellow"/>
+        </w:rPr>
         <w:t xml:space="preserve">? </w:t>
       </w:r>
+      <w:bookmarkStart w:id="0" w:name="_GoBack"/>
+      <w:bookmarkEnd w:id="0"/>
     </w:p>
     <w:p>
       <w:pPr>
@@ -650,8 +678,14 @@
           <w:numId w:val="11"/>
         </w:numPr>
         <w:spacing w:before="100" w:beforeAutospacing="1" w:after="100" w:afterAutospacing="1" w:line="240" w:lineRule="auto"/>
-      </w:pPr>
-      <w:r>
+        <w:rPr>
+          <w:highlight w:val="yellow"/>
+        </w:rPr>
+      </w:pPr>
+      <w:r>
+        <w:rPr>
+          <w:highlight w:val="yellow"/>
+        </w:rPr>
         <w:t xml:space="preserve">How does cascading failure occur in Microservices? </w:t>
       </w:r>
     </w:p>
@@ -662,16 +696,28 @@
           <w:numId w:val="11"/>
         </w:numPr>
         <w:spacing w:before="100" w:beforeAutospacing="1" w:after="100" w:afterAutospacing="1" w:line="240" w:lineRule="auto"/>
-      </w:pPr>
-      <w:r>
+        <w:rPr>
+          <w:highlight w:val="yellow"/>
+        </w:rPr>
+      </w:pPr>
+      <w:r>
+        <w:rPr>
+          <w:highlight w:val="yellow"/>
+        </w:rPr>
         <w:t xml:space="preserve">How can </w:t>
       </w:r>
       <w:proofErr w:type="gramStart"/>
       <w:r>
+        <w:rPr>
+          <w:highlight w:val="yellow"/>
+        </w:rPr>
         <w:t>cascading</w:t>
       </w:r>
       <w:proofErr w:type="gramEnd"/>
       <w:r>
+        <w:rPr>
+          <w:highlight w:val="yellow"/>
+        </w:rPr>
         <w:t xml:space="preserve"> failures be prevented? </w:t>
       </w:r>
     </w:p>
@@ -28617,7 +28663,7 @@
 </file>
 
 <file path=customXml/itemProps1.xml><?xml version="1.0" encoding="utf-8"?>
-<ds:datastoreItem xmlns:ds="http://schemas.openxmlformats.org/officeDocument/2006/customXml" ds:itemID="{2017ACBD-49F4-481D-9079-F8920052DC61}">
+<ds:datastoreItem xmlns:ds="http://schemas.openxmlformats.org/officeDocument/2006/customXml" ds:itemID="{DAD22AE2-5BD2-45E6-82E4-BE5645251252}">
   <ds:schemaRefs>
     <ds:schemaRef ds:uri="http://schemas.openxmlformats.org/officeDocument/2006/bibliography"/>
   </ds:schemaRefs>

</xml_diff>